<commit_message>
fix(build-docx): force font on heading styles via explicit w:rFonts (was Calibri via theme)
python-docx's style.font.name=X writes one rFonts attribute but leaves theme references (asciiTheme, hAnsiTheme) intact. Word's heading styles use those theme refs and resolve to '+Headings' (Calibri default), ignoring the explicit Geist Mono assignment. Fix: set all four script attributes (ascii, hAnsi, cs, eastAsia) AND remove theme attributes so Word can't fall back. Verified: regenerated reference.docx now has Geist Mono with asciiTheme=None on Heading 1/2/3.
</commit_message>
<xml_diff>
--- a/skills/build-docx/reference.docx
+++ b/skills/build-docx/reference.docx
@@ -385,7 +385,7 @@
       <w:spacing w:line="360" w:lineRule="auto" w:after="160"/>
     </w:pPr>
     <w:rPr>
-      <w:rFonts w:ascii="Geist" w:hAnsi="Geist"/>
+      <w:rFonts w:ascii="Geist" w:hAnsi="Geist" w:cs="Geist" w:eastAsia="Geist"/>
       <w:b w:val="0"/>
       <w:color w:val="14141C"/>
       <w:sz w:val="22"/>
@@ -450,7 +450,7 @@
       <w:outlineLvl w:val="0"/>
     </w:pPr>
     <w:rPr>
-      <w:rFonts w:asciiTheme="majorHAnsi" w:eastAsiaTheme="majorEastAsia" w:hAnsiTheme="majorHAnsi" w:cstheme="majorBidi" w:ascii="Geist Mono" w:hAnsi="Geist Mono"/>
+      <w:rFonts w:ascii="Geist Mono" w:hAnsi="Geist Mono" w:cs="Geist Mono" w:eastAsia="Geist Mono"/>
       <w:b/>
       <w:bCs/>
       <w:color w:val="40E0D0"/>
@@ -474,7 +474,7 @@
       <w:outlineLvl w:val="1"/>
     </w:pPr>
     <w:rPr>
-      <w:rFonts w:asciiTheme="majorHAnsi" w:eastAsiaTheme="majorEastAsia" w:hAnsiTheme="majorHAnsi" w:cstheme="majorBidi" w:ascii="Geist Mono" w:hAnsi="Geist Mono"/>
+      <w:rFonts w:ascii="Geist Mono" w:hAnsi="Geist Mono" w:cs="Geist Mono" w:eastAsia="Geist Mono"/>
       <w:b/>
       <w:bCs/>
       <w:color w:val="FF1493"/>
@@ -498,7 +498,7 @@
       <w:outlineLvl w:val="2"/>
     </w:pPr>
     <w:rPr>
-      <w:rFonts w:asciiTheme="majorHAnsi" w:eastAsiaTheme="majorEastAsia" w:hAnsiTheme="majorHAnsi" w:cstheme="majorBidi" w:ascii="Geist Mono" w:hAnsi="Geist Mono"/>
+      <w:rFonts w:ascii="Geist Mono" w:hAnsi="Geist Mono" w:cs="Geist Mono" w:eastAsia="Geist Mono"/>
       <w:b/>
       <w:bCs/>
       <w:color w:val="14141C"/>
@@ -740,7 +740,7 @@
       <w:contextualSpacing/>
     </w:pPr>
     <w:rPr>
-      <w:rFonts w:asciiTheme="majorHAnsi" w:eastAsiaTheme="majorEastAsia" w:hAnsiTheme="majorHAnsi" w:cstheme="majorBidi" w:ascii="Geist Mono" w:hAnsi="Geist Mono"/>
+      <w:rFonts w:ascii="Geist Mono" w:hAnsi="Geist Mono" w:cs="Geist Mono" w:eastAsia="Geist Mono"/>
       <w:b/>
       <w:color w:val="14141C"/>
       <w:spacing w:val="5"/>
@@ -778,7 +778,7 @@
       </w:numPr>
     </w:pPr>
     <w:rPr>
-      <w:rFonts w:asciiTheme="majorHAnsi" w:eastAsiaTheme="majorEastAsia" w:hAnsiTheme="majorHAnsi" w:cstheme="majorBidi" w:ascii="Geist" w:hAnsi="Geist"/>
+      <w:rFonts w:ascii="Geist" w:hAnsi="Geist" w:cs="Geist" w:eastAsia="Geist"/>
       <w:b w:val="0"/>
       <w:i/>
       <w:iCs/>
@@ -12079,7 +12079,7 @@
   <w:style w:type="paragraph" w:customStyle="1" w:styleId="SourceCode">
     <w:name w:val="Source Code"/>
     <w:rPr>
-      <w:rFonts w:ascii="Geist Mono" w:hAnsi="Geist Mono"/>
+      <w:rFonts w:ascii="Geist Mono" w:hAnsi="Geist Mono" w:cs="Geist Mono" w:eastAsia="Geist Mono"/>
       <w:b w:val="0"/>
       <w:color w:val="14141C"/>
       <w:sz w:val="19"/>
@@ -12088,7 +12088,7 @@
   <w:style w:type="character" w:customStyle="1" w:styleId="VerbatimChar">
     <w:name w:val="Verbatim Char"/>
     <w:rPr>
-      <w:rFonts w:ascii="Geist Mono" w:hAnsi="Geist Mono"/>
+      <w:rFonts w:ascii="Geist Mono" w:hAnsi="Geist Mono" w:cs="Geist Mono" w:eastAsia="Geist Mono"/>
       <w:b w:val="0"/>
       <w:color w:val="14141C"/>
       <w:sz w:val="20"/>
@@ -12100,7 +12100,7 @@
       <w:ind w:left="720"/>
     </w:pPr>
     <w:rPr>
-      <w:rFonts w:ascii="Geist" w:hAnsi="Geist"/>
+      <w:rFonts w:ascii="Geist" w:hAnsi="Geist" w:cs="Geist" w:eastAsia="Geist"/>
       <w:b w:val="0"/>
       <w:i/>
       <w:color w:val="14141C"/>

</xml_diff>